<commit_message>
Update ali pro cv aesthetic blue - a4.docx
updated the CV with addl details
</commit_message>
<xml_diff>
--- a/CV/ali pro cv aesthetic blue - a4.docx
+++ b/CV/ali pro cv aesthetic blue - a4.docx
@@ -18,9 +18,9 @@
         <w:tblLook w:val="04A0" w:firstRow="1" w:lastRow="0" w:firstColumn="1" w:lastColumn="0" w:noHBand="0" w:noVBand="1"/>
       </w:tblPr>
       <w:tblGrid>
-        <w:gridCol w:w="5099"/>
-        <w:gridCol w:w="5827"/>
-        <w:gridCol w:w="72"/>
+        <w:gridCol w:w="4879"/>
+        <w:gridCol w:w="6051"/>
+        <w:gridCol w:w="68"/>
       </w:tblGrid>
       <w:tr>
         <w:trPr>
@@ -92,7 +92,31 @@
                 <w:sz w:val="28"/>
                 <w:szCs w:val="28"/>
               </w:rPr>
-              <w:t>NETWORKING AND TELECOM ENGINEER</w:t>
+              <w:t xml:space="preserve">NETWORKING AND </w:t>
+            </w:r>
+            <w:r>
+              <w:rPr>
+                <w:rFonts w:ascii="Inter 18pt 18pt SemiBold" w:hAnsi="Inter 18pt 18pt SemiBold" w:cs="Times New Roman (Body CS)"/>
+                <w:b/>
+                <w:bCs/>
+                <w:color w:val="24272E"/>
+                <w:spacing w:val="20"/>
+                <w:sz w:val="28"/>
+                <w:szCs w:val="28"/>
+              </w:rPr>
+              <w:t>SYSTEMS</w:t>
+            </w:r>
+            <w:r>
+              <w:rPr>
+                <w:rFonts w:ascii="Inter 18pt 18pt SemiBold" w:hAnsi="Inter 18pt 18pt SemiBold" w:cs="Times New Roman (Body CS)"/>
+                <w:b/>
+                <w:bCs/>
+                <w:color w:val="24272E"/>
+                <w:spacing w:val="20"/>
+                <w:sz w:val="28"/>
+                <w:szCs w:val="28"/>
+              </w:rPr>
+              <w:t xml:space="preserve"> ENGINEER</w:t>
             </w:r>
           </w:p>
         </w:tc>
@@ -127,7 +151,7 @@
             </w:tblGrid>
             <w:tr>
               <w:trPr>
-                <w:trHeight w:val="536"/>
+                <w:trHeight w:val="403"/>
               </w:trPr>
               <w:tc>
                 <w:tcPr>
@@ -140,7 +164,7 @@
                 </w:tcPr>
                 <w:p>
                   <w:pPr>
-                    <w:spacing w:before="240" w:line="360" w:lineRule="auto"/>
+                    <w:spacing w:line="360" w:lineRule="auto"/>
                     <w:ind w:left="113"/>
                     <w:rPr>
                       <w:rFonts w:ascii="Inter 18pt 18pt" w:hAnsi="Inter 18pt 18pt"/>
@@ -171,7 +195,7 @@
                 </w:tcPr>
                 <w:p>
                   <w:pPr>
-                    <w:spacing w:before="240" w:line="360" w:lineRule="auto"/>
+                    <w:spacing w:line="360" w:lineRule="auto"/>
                     <w:rPr>
                       <w:rFonts w:ascii="Inter 18pt 18pt" w:hAnsi="Inter 18pt 18pt"/>
                       <w:color w:val="52575E"/>
@@ -193,7 +217,7 @@
             </w:tr>
             <w:tr>
               <w:trPr>
-                <w:trHeight w:val="318"/>
+                <w:trHeight w:val="403"/>
               </w:trPr>
               <w:tc>
                 <w:tcPr>
@@ -257,7 +281,7 @@
             </w:tr>
             <w:tr>
               <w:trPr>
-                <w:trHeight w:val="325"/>
+                <w:trHeight w:val="403"/>
               </w:trPr>
               <w:tc>
                 <w:tcPr>
@@ -321,20 +345,18 @@
             </w:tr>
             <w:tr>
               <w:trPr>
-                <w:trHeight w:val="536"/>
+                <w:trHeight w:val="403"/>
               </w:trPr>
               <w:tc>
                 <w:tcPr>
                   <w:tcW w:w="1757" w:type="dxa"/>
                   <w:tcBorders>
                     <w:left w:val="single" w:sz="6" w:space="0" w:color="1588CF"/>
-                    <w:bottom w:val="single" w:sz="6" w:space="0" w:color="1588CF"/>
                   </w:tcBorders>
                   <w:vAlign w:val="center"/>
                 </w:tcPr>
                 <w:p>
                   <w:pPr>
-                    <w:spacing w:after="240"/>
                     <w:ind w:left="113"/>
                     <w:rPr>
                       <w:rFonts w:ascii="Inter 18pt 18pt" w:hAnsi="Inter 18pt 18pt"/>
@@ -358,14 +380,12 @@
                 <w:tcPr>
                   <w:tcW w:w="3742" w:type="dxa"/>
                   <w:tcBorders>
-                    <w:bottom w:val="single" w:sz="6" w:space="0" w:color="1588CF"/>
                     <w:right w:val="single" w:sz="6" w:space="0" w:color="1588CF"/>
                   </w:tcBorders>
                   <w:vAlign w:val="center"/>
                 </w:tcPr>
                 <w:p>
                   <w:pPr>
-                    <w:spacing w:after="240"/>
                     <w:rPr>
                       <w:rFonts w:ascii="Inter 18pt 18pt" w:hAnsi="Inter 18pt 18pt"/>
                       <w:color w:val="52575E"/>
@@ -385,6 +405,114 @@
                 </w:p>
               </w:tc>
             </w:tr>
+            <w:tr>
+              <w:trPr>
+                <w:trHeight w:val="403"/>
+              </w:trPr>
+              <w:tc>
+                <w:tcPr>
+                  <w:tcW w:w="1757" w:type="dxa"/>
+                  <w:tcBorders>
+                    <w:left w:val="single" w:sz="6" w:space="0" w:color="1588CF"/>
+                    <w:bottom w:val="single" w:sz="6" w:space="0" w:color="1588CF"/>
+                  </w:tcBorders>
+                  <w:vAlign w:val="center"/>
+                </w:tcPr>
+                <w:p>
+                  <w:pPr>
+                    <w:rPr>
+                      <w:rFonts w:ascii="Inter 18pt 18pt" w:hAnsi="Inter 18pt 18pt"/>
+                      <w:color w:val="1588CF"/>
+                      <w:sz w:val="22"/>
+                      <w:szCs w:val="22"/>
+                    </w:rPr>
+                  </w:pPr>
+                  <w:r>
+                    <w:rPr>
+                      <w:rFonts w:ascii="Inter 18pt 18pt" w:hAnsi="Inter 18pt 18pt"/>
+                      <w:color w:val="1588CF"/>
+                      <w:sz w:val="22"/>
+                      <w:szCs w:val="22"/>
+                    </w:rPr>
+                    <w:t xml:space="preserve"> </w:t>
+                  </w:r>
+                  <w:r>
+                    <w:rPr>
+                      <w:rFonts w:ascii="Inter 18pt 18pt" w:hAnsi="Inter 18pt 18pt"/>
+                      <w:color w:val="1588CF"/>
+                      <w:sz w:val="22"/>
+                      <w:szCs w:val="22"/>
+                    </w:rPr>
+                    <w:t xml:space="preserve"> </w:t>
+                  </w:r>
+                  <w:r>
+                    <w:rPr>
+                      <w:rFonts w:ascii="Inter 18pt 18pt" w:hAnsi="Inter 18pt 18pt"/>
+                      <w:color w:val="1588CF"/>
+                      <w:sz w:val="22"/>
+                      <w:szCs w:val="22"/>
+                    </w:rPr>
+                    <w:t>Modus-Op</w:t>
+                  </w:r>
+                </w:p>
+              </w:tc>
+              <w:tc>
+                <w:tcPr>
+                  <w:tcW w:w="3742" w:type="dxa"/>
+                  <w:tcBorders>
+                    <w:bottom w:val="single" w:sz="6" w:space="0" w:color="1588CF"/>
+                    <w:right w:val="single" w:sz="6" w:space="0" w:color="1588CF"/>
+                  </w:tcBorders>
+                  <w:vAlign w:val="center"/>
+                </w:tcPr>
+                <w:p>
+                  <w:pPr>
+                    <w:rPr>
+                      <w:rFonts w:ascii="Inter 18pt 18pt" w:hAnsi="Inter 18pt 18pt"/>
+                      <w:color w:val="52575E"/>
+                      <w:sz w:val="22"/>
+                      <w:szCs w:val="22"/>
+                    </w:rPr>
+                  </w:pPr>
+                  <w:r>
+                    <w:rPr>
+                      <w:rFonts w:ascii="Inter 18pt 18pt" w:hAnsi="Inter 18pt 18pt"/>
+                      <w:color w:val="52575E"/>
+                      <w:sz w:val="22"/>
+                      <w:szCs w:val="22"/>
+                    </w:rPr>
+                    <w:t>On-site</w:t>
+                  </w:r>
+                  <w:r>
+                    <w:rPr>
+                      <w:rFonts w:ascii="Inter 18pt 18pt" w:hAnsi="Inter 18pt 18pt"/>
+                      <w:color w:val="52575E"/>
+                      <w:sz w:val="22"/>
+                      <w:szCs w:val="22"/>
+                    </w:rPr>
+                    <w:t xml:space="preserve"> (Pakistan)</w:t>
+                  </w:r>
+                  <w:r>
+                    <w:rPr>
+                      <w:rFonts w:ascii="Inter 18pt 18pt" w:hAnsi="Inter 18pt 18pt"/>
+                      <w:color w:val="52575E"/>
+                      <w:sz w:val="22"/>
+                      <w:szCs w:val="22"/>
+                    </w:rPr>
+                    <w:t xml:space="preserve"> / Remote</w:t>
+                  </w:r>
+                  <w:r>
+                    <w:rPr>
+                      <w:rFonts w:ascii="Inter 18pt 18pt" w:hAnsi="Inter 18pt 18pt"/>
+                      <w:color w:val="52575E"/>
+                      <w:sz w:val="22"/>
+                      <w:szCs w:val="22"/>
+                    </w:rPr>
+                    <w:t xml:space="preserve"> (Global)</w:t>
+                  </w:r>
+                </w:p>
+              </w:tc>
+            </w:tr>
           </w:tbl>
           <w:p>
             <w:pPr>
@@ -433,17 +561,9 @@
               <mc:AlternateContent>
                 <mc:Choice Requires="wps">
                   <w:drawing>
-                    <wp:anchor distT="0" distB="0" distL="114300" distR="114300" simplePos="0" relativeHeight="251675648" behindDoc="0" locked="0" layoutInCell="1" allowOverlap="1" wp14:anchorId="60F2F096" wp14:editId="31FAB6AE">
-                      <wp:simplePos x="0" y="0"/>
-                      <wp:positionH relativeFrom="column">
-                        <wp:posOffset>-144941</wp:posOffset>
-                      </wp:positionH>
-                      <wp:positionV relativeFrom="paragraph">
-                        <wp:posOffset>6350</wp:posOffset>
-                      </wp:positionV>
+                    <wp:inline distT="0" distB="0" distL="0" distR="0" wp14:anchorId="60F2F096" wp14:editId="39825361">
                       <wp:extent cx="7113280" cy="0"/>
-                      <wp:effectExtent l="0" t="19050" r="49530" b="38100"/>
-                      <wp:wrapNone/>
+                      <wp:effectExtent l="0" t="38100" r="49530" b="38100"/>
                       <wp:docPr id="2127625352" name="Straight Connector 32"/>
                       <wp:cNvGraphicFramePr/>
                       <a:graphic xmlns:a="http://schemas.openxmlformats.org/drawingml/2006/main">
@@ -458,7 +578,7 @@
                               <a:prstGeom prst="line">
                                 <a:avLst/>
                               </a:prstGeom>
-                              <a:ln w="47625" cmpd="thinThick">
+                              <a:ln w="76200" cmpd="thinThick">
                                 <a:solidFill>
                                   <a:srgbClr val="1588CF"/>
                                 </a:solidFill>
@@ -482,19 +602,14 @@
                           </wps:wsp>
                         </a:graphicData>
                       </a:graphic>
-                      <wp14:sizeRelH relativeFrom="margin">
-                        <wp14:pctWidth>0</wp14:pctWidth>
-                      </wp14:sizeRelH>
-                      <wp14:sizeRelV relativeFrom="margin">
-                        <wp14:pctHeight>0</wp14:pctHeight>
-                      </wp14:sizeRelV>
-                    </wp:anchor>
+                    </wp:inline>
                   </w:drawing>
                 </mc:Choice>
                 <mc:Fallback>
                   <w:pict>
-                    <v:line w14:anchorId="290B8699" id="Straight Connector 32" o:spid="_x0000_s1026" style="position:absolute;z-index:251675648;visibility:visible;mso-wrap-style:square;mso-width-percent:0;mso-height-percent:0;mso-wrap-distance-left:9pt;mso-wrap-distance-top:0;mso-wrap-distance-right:9pt;mso-wrap-distance-bottom:0;mso-position-horizontal:absolute;mso-position-horizontal-relative:text;mso-position-vertical:absolute;mso-position-vertical-relative:text;mso-width-percent:0;mso-height-percent:0;mso-width-relative:margin;mso-height-relative:margin" from="-11.4pt,.5pt" to="548.7pt,.5pt" o:gfxdata="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" strokecolor="#1588cf" strokeweight="3.75pt">
+                    <v:line w14:anchorId="59A84B9F" id="Straight Connector 32" o:spid="_x0000_s1026" style="visibility:visible;mso-wrap-style:square;mso-left-percent:-10001;mso-top-percent:-10001;mso-position-horizontal:absolute;mso-position-horizontal-relative:char;mso-position-vertical:absolute;mso-position-vertical-relative:line;mso-left-percent:-10001;mso-top-percent:-10001" from="0,0" to="560.1pt,0" o:gfxdata="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" strokecolor="#1588cf" strokeweight="6pt">
                       <v:stroke linestyle="thinThick" joinstyle="miter"/>
+                      <w10:anchorlock/>
                     </v:line>
                   </w:pict>
                 </mc:Fallback>
@@ -569,17 +684,9 @@
               <mc:AlternateContent>
                 <mc:Choice Requires="wps">
                   <w:drawing>
-                    <wp:anchor distT="0" distB="0" distL="114300" distR="114300" simplePos="0" relativeHeight="251659264" behindDoc="0" locked="0" layoutInCell="1" allowOverlap="1" wp14:anchorId="445A68BE" wp14:editId="36A10275">
-                      <wp:simplePos x="0" y="0"/>
-                      <wp:positionH relativeFrom="column">
-                        <wp:posOffset>-132876</wp:posOffset>
-                      </wp:positionH>
-                      <wp:positionV relativeFrom="paragraph">
-                        <wp:posOffset>46355</wp:posOffset>
-                      </wp:positionV>
+                    <wp:inline distT="0" distB="0" distL="0" distR="0" wp14:anchorId="445A68BE" wp14:editId="4873CD4A">
                       <wp:extent cx="7092000" cy="0"/>
-                      <wp:effectExtent l="0" t="19050" r="33020" b="19050"/>
-                      <wp:wrapNone/>
+                      <wp:effectExtent l="0" t="38100" r="52070" b="38100"/>
                       <wp:docPr id="1103464770" name="Straight Connector 32"/>
                       <wp:cNvGraphicFramePr/>
                       <a:graphic xmlns:a="http://schemas.openxmlformats.org/drawingml/2006/main">
@@ -594,7 +701,7 @@
                               <a:prstGeom prst="line">
                                 <a:avLst/>
                               </a:prstGeom>
-                              <a:ln w="38100">
+                              <a:ln w="76200">
                                 <a:solidFill>
                                   <a:srgbClr val="CBCFD4"/>
                                 </a:solidFill>
@@ -618,16 +725,14 @@
                           </wps:wsp>
                         </a:graphicData>
                       </a:graphic>
-                      <wp14:sizeRelH relativeFrom="margin">
-                        <wp14:pctWidth>0</wp14:pctWidth>
-                      </wp14:sizeRelH>
-                    </wp:anchor>
+                    </wp:inline>
                   </w:drawing>
                 </mc:Choice>
                 <mc:Fallback>
                   <w:pict>
-                    <v:line w14:anchorId="65B98542" id="Straight Connector 32" o:spid="_x0000_s1026" style="position:absolute;z-index:251659264;visibility:visible;mso-wrap-style:square;mso-width-percent:0;mso-wrap-distance-left:9pt;mso-wrap-distance-top:0;mso-wrap-distance-right:9pt;mso-wrap-distance-bottom:0;mso-position-horizontal:absolute;mso-position-horizontal-relative:text;mso-position-vertical:absolute;mso-position-vertical-relative:text;mso-width-percent:0;mso-width-relative:margin" from="-10.45pt,3.65pt" to="548pt,3.65pt" o:gfxdata="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" strokecolor="#cbcfd4" strokeweight="3pt">
+                    <v:line w14:anchorId="3368FF28" id="Straight Connector 32" o:spid="_x0000_s1026" style="visibility:visible;mso-wrap-style:square;mso-left-percent:-10001;mso-top-percent:-10001;mso-position-horizontal:absolute;mso-position-horizontal-relative:char;mso-position-vertical:absolute;mso-position-vertical-relative:line;mso-left-percent:-10001;mso-top-percent:-10001" from="0,0" to="558.45pt,0" o:gfxdata="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" strokecolor="#cbcfd4" strokeweight="6pt">
                       <v:stroke joinstyle="miter"/>
+                      <w10:anchorlock/>
                     </v:line>
                   </w:pict>
                 </mc:Fallback>
@@ -840,6 +945,15 @@
           <w:p>
             <w:pPr>
               <w:rPr>
+                <w:rFonts w:ascii="Inter 18pt 18pt" w:hAnsi="Inter 18pt 18pt"/>
+                <w:sz w:val="32"/>
+                <w:szCs w:val="32"/>
+              </w:rPr>
+            </w:pPr>
+          </w:p>
+          <w:p>
+            <w:pPr>
+              <w:rPr>
                 <w:rFonts w:ascii="Playfair Display" w:hAnsi="Playfair Display" w:cs="Times New Roman (Body CS)"/>
                 <w:b/>
                 <w:bCs/>
@@ -881,17 +995,9 @@
               <mc:AlternateContent>
                 <mc:Choice Requires="wps">
                   <w:drawing>
-                    <wp:anchor distT="0" distB="0" distL="114300" distR="114300" simplePos="0" relativeHeight="251661312" behindDoc="0" locked="0" layoutInCell="1" allowOverlap="1" wp14:anchorId="1CF543E6" wp14:editId="4133922E">
-                      <wp:simplePos x="0" y="0"/>
-                      <wp:positionH relativeFrom="column">
-                        <wp:posOffset>-130336</wp:posOffset>
-                      </wp:positionH>
-                      <wp:positionV relativeFrom="paragraph">
-                        <wp:posOffset>74930</wp:posOffset>
-                      </wp:positionV>
+                    <wp:inline distT="0" distB="0" distL="0" distR="0" wp14:anchorId="1CF543E6" wp14:editId="58C0A687">
                       <wp:extent cx="7092000" cy="0"/>
-                      <wp:effectExtent l="0" t="19050" r="33020" b="19050"/>
-                      <wp:wrapNone/>
+                      <wp:effectExtent l="0" t="38100" r="52070" b="38100"/>
                       <wp:docPr id="1900433605" name="Straight Connector 32"/>
                       <wp:cNvGraphicFramePr/>
                       <a:graphic xmlns:a="http://schemas.openxmlformats.org/drawingml/2006/main">
@@ -906,7 +1012,7 @@
                               <a:prstGeom prst="line">
                                 <a:avLst/>
                               </a:prstGeom>
-                              <a:ln w="38100">
+                              <a:ln w="76200">
                                 <a:solidFill>
                                   <a:srgbClr val="CBCFD4"/>
                                 </a:solidFill>
@@ -930,16 +1036,14 @@
                           </wps:wsp>
                         </a:graphicData>
                       </a:graphic>
-                      <wp14:sizeRelH relativeFrom="margin">
-                        <wp14:pctWidth>0</wp14:pctWidth>
-                      </wp14:sizeRelH>
-                    </wp:anchor>
+                    </wp:inline>
                   </w:drawing>
                 </mc:Choice>
                 <mc:Fallback>
                   <w:pict>
-                    <v:line w14:anchorId="3BE9F03D" id="Straight Connector 32" o:spid="_x0000_s1026" style="position:absolute;z-index:251661312;visibility:visible;mso-wrap-style:square;mso-width-percent:0;mso-wrap-distance-left:9pt;mso-wrap-distance-top:0;mso-wrap-distance-right:9pt;mso-wrap-distance-bottom:0;mso-position-horizontal:absolute;mso-position-horizontal-relative:text;mso-position-vertical:absolute;mso-position-vertical-relative:text;mso-width-percent:0;mso-width-relative:margin" from="-10.25pt,5.9pt" to="548.2pt,5.9pt" o:gfxdata="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" strokecolor="#cbcfd4" strokeweight="3pt">
+                    <v:line w14:anchorId="1079583F" id="Straight Connector 32" o:spid="_x0000_s1026" style="visibility:visible;mso-wrap-style:square;mso-left-percent:-10001;mso-top-percent:-10001;mso-position-horizontal:absolute;mso-position-horizontal-relative:char;mso-position-vertical:absolute;mso-position-vertical-relative:line;mso-left-percent:-10001;mso-top-percent:-10001" from="0,0" to="558.45pt,0" o:gfxdata="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" strokecolor="#cbcfd4" strokeweight="6pt">
                       <v:stroke joinstyle="miter"/>
+                      <w10:anchorlock/>
                     </v:line>
                   </w:pict>
                 </mc:Fallback>
@@ -1108,6 +1212,16 @@
           <w:p>
             <w:pPr>
               <w:rPr>
+                <w:rFonts w:ascii="Inter 18pt 18pt" w:hAnsi="Inter 18pt 18pt"/>
+                <w:color w:val="52575E"/>
+                <w:sz w:val="32"/>
+                <w:szCs w:val="32"/>
+              </w:rPr>
+            </w:pPr>
+          </w:p>
+          <w:p>
+            <w:pPr>
+              <w:rPr>
                 <w:rFonts w:ascii="Playfair Display" w:hAnsi="Playfair Display" w:cs="Times New Roman (Body CS)"/>
                 <w:b/>
                 <w:bCs/>
@@ -1150,17 +1264,9 @@
               <mc:AlternateContent>
                 <mc:Choice Requires="wps">
                   <w:drawing>
-                    <wp:anchor distT="0" distB="0" distL="114300" distR="114300" simplePos="0" relativeHeight="251663360" behindDoc="0" locked="0" layoutInCell="1" allowOverlap="1" wp14:anchorId="4B0DB6E0" wp14:editId="3DD90111">
-                      <wp:simplePos x="0" y="0"/>
-                      <wp:positionH relativeFrom="column">
-                        <wp:posOffset>-129379</wp:posOffset>
-                      </wp:positionH>
-                      <wp:positionV relativeFrom="paragraph">
-                        <wp:posOffset>70485</wp:posOffset>
-                      </wp:positionV>
+                    <wp:inline distT="0" distB="0" distL="0" distR="0" wp14:anchorId="4B0DB6E0" wp14:editId="3838B905">
                       <wp:extent cx="7092000" cy="0"/>
-                      <wp:effectExtent l="0" t="19050" r="33020" b="19050"/>
-                      <wp:wrapNone/>
+                      <wp:effectExtent l="0" t="38100" r="52070" b="38100"/>
                       <wp:docPr id="765303264" name="Straight Connector 32"/>
                       <wp:cNvGraphicFramePr/>
                       <a:graphic xmlns:a="http://schemas.openxmlformats.org/drawingml/2006/main">
@@ -1175,7 +1281,7 @@
                               <a:prstGeom prst="line">
                                 <a:avLst/>
                               </a:prstGeom>
-                              <a:ln w="38100">
+                              <a:ln w="76200">
                                 <a:solidFill>
                                   <a:srgbClr val="CBCFD4"/>
                                 </a:solidFill>
@@ -1199,16 +1305,14 @@
                           </wps:wsp>
                         </a:graphicData>
                       </a:graphic>
-                      <wp14:sizeRelH relativeFrom="margin">
-                        <wp14:pctWidth>0</wp14:pctWidth>
-                      </wp14:sizeRelH>
-                    </wp:anchor>
+                    </wp:inline>
                   </w:drawing>
                 </mc:Choice>
                 <mc:Fallback>
                   <w:pict>
-                    <v:line w14:anchorId="275E70F2" id="Straight Connector 32" o:spid="_x0000_s1026" style="position:absolute;z-index:251663360;visibility:visible;mso-wrap-style:square;mso-width-percent:0;mso-wrap-distance-left:9pt;mso-wrap-distance-top:0;mso-wrap-distance-right:9pt;mso-wrap-distance-bottom:0;mso-position-horizontal:absolute;mso-position-horizontal-relative:text;mso-position-vertical:absolute;mso-position-vertical-relative:text;mso-width-percent:0;mso-width-relative:margin" from="-10.2pt,5.55pt" to="548.25pt,5.55pt" o:gfxdata="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" strokecolor="#cbcfd4" strokeweight="3pt">
+                    <v:line w14:anchorId="2D9B1761" id="Straight Connector 32" o:spid="_x0000_s1026" style="visibility:visible;mso-wrap-style:square;mso-left-percent:-10001;mso-top-percent:-10001;mso-position-horizontal:absolute;mso-position-horizontal-relative:char;mso-position-vertical:absolute;mso-position-vertical-relative:line;mso-left-percent:-10001;mso-top-percent:-10001" from="0,0" to="558.45pt,0" o:gfxdata="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" strokecolor="#cbcfd4" strokeweight="6pt">
                       <v:stroke joinstyle="miter"/>
+                      <w10:anchorlock/>
                     </v:line>
                   </w:pict>
                 </mc:Fallback>
@@ -1344,6 +1448,16 @@
           </w:p>
           <w:p>
             <w:pPr>
+              <w:snapToGrid w:val="0"/>
+              <w:rPr>
+                <w:rFonts w:ascii="Inter 18pt 18pt" w:hAnsi="Inter 18pt 18pt"/>
+                <w:sz w:val="32"/>
+                <w:szCs w:val="32"/>
+              </w:rPr>
+            </w:pPr>
+          </w:p>
+          <w:p>
+            <w:pPr>
               <w:rPr>
                 <w:rFonts w:ascii="Playfair Display" w:hAnsi="Playfair Display" w:cs="Times New Roman (Body CS)"/>
                 <w:b/>
@@ -1398,17 +1512,9 @@
               <mc:AlternateContent>
                 <mc:Choice Requires="wps">
                   <w:drawing>
-                    <wp:anchor distT="0" distB="0" distL="114300" distR="114300" simplePos="0" relativeHeight="251665408" behindDoc="0" locked="0" layoutInCell="1" allowOverlap="1" wp14:anchorId="36043402" wp14:editId="22BA46CA">
-                      <wp:simplePos x="0" y="0"/>
-                      <wp:positionH relativeFrom="column">
-                        <wp:posOffset>-129379</wp:posOffset>
-                      </wp:positionH>
-                      <wp:positionV relativeFrom="paragraph">
-                        <wp:posOffset>69850</wp:posOffset>
-                      </wp:positionV>
+                    <wp:inline distT="0" distB="0" distL="0" distR="0" wp14:anchorId="36043402" wp14:editId="038BFAA9">
                       <wp:extent cx="7092000" cy="0"/>
-                      <wp:effectExtent l="0" t="19050" r="33020" b="19050"/>
-                      <wp:wrapNone/>
+                      <wp:effectExtent l="0" t="38100" r="52070" b="38100"/>
                       <wp:docPr id="1019689834" name="Straight Connector 32"/>
                       <wp:cNvGraphicFramePr/>
                       <a:graphic xmlns:a="http://schemas.openxmlformats.org/drawingml/2006/main">
@@ -1423,7 +1529,7 @@
                               <a:prstGeom prst="line">
                                 <a:avLst/>
                               </a:prstGeom>
-                              <a:ln w="38100">
+                              <a:ln w="76200">
                                 <a:solidFill>
                                   <a:srgbClr val="CBCFD4"/>
                                 </a:solidFill>
@@ -1447,16 +1553,14 @@
                           </wps:wsp>
                         </a:graphicData>
                       </a:graphic>
-                      <wp14:sizeRelH relativeFrom="margin">
-                        <wp14:pctWidth>0</wp14:pctWidth>
-                      </wp14:sizeRelH>
-                    </wp:anchor>
+                    </wp:inline>
                   </w:drawing>
                 </mc:Choice>
                 <mc:Fallback>
                   <w:pict>
-                    <v:line w14:anchorId="7E02904A" id="Straight Connector 32" o:spid="_x0000_s1026" style="position:absolute;z-index:251665408;visibility:visible;mso-wrap-style:square;mso-width-percent:0;mso-wrap-distance-left:9pt;mso-wrap-distance-top:0;mso-wrap-distance-right:9pt;mso-wrap-distance-bottom:0;mso-position-horizontal:absolute;mso-position-horizontal-relative:text;mso-position-vertical:absolute;mso-position-vertical-relative:text;mso-width-percent:0;mso-width-relative:margin" from="-10.2pt,5.5pt" to="548.25pt,5.5pt" o:gfxdata="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" strokecolor="#cbcfd4" strokeweight="3pt">
+                    <v:line w14:anchorId="4611A652" id="Straight Connector 32" o:spid="_x0000_s1026" style="visibility:visible;mso-wrap-style:square;mso-left-percent:-10001;mso-top-percent:-10001;mso-position-horizontal:absolute;mso-position-horizontal-relative:char;mso-position-vertical:absolute;mso-position-vertical-relative:line;mso-left-percent:-10001;mso-top-percent:-10001" from="0,0" to="558.45pt,0" o:gfxdata="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" strokecolor="#cbcfd4" strokeweight="6pt">
                       <v:stroke joinstyle="miter"/>
+                      <w10:anchorlock/>
                     </v:line>
                   </w:pict>
                 </mc:Fallback>
@@ -1938,6 +2042,18 @@
                 <w:szCs w:val="28"/>
               </w:rPr>
             </w:pPr>
+          </w:p>
+          <w:p>
+            <w:pPr>
+              <w:rPr>
+                <w:rFonts w:ascii="Playfair Display" w:hAnsi="Playfair Display" w:cs="Times New Roman (Body CS)"/>
+                <w:b/>
+                <w:bCs/>
+                <w:color w:val="1588CF"/>
+                <w:sz w:val="28"/>
+                <w:szCs w:val="28"/>
+              </w:rPr>
+            </w:pPr>
             <w:r>
               <w:rPr>
                 <w:rFonts w:ascii="Playfair Display" w:hAnsi="Playfair Display" w:cs="Times New Roman (Body CS)"/>
@@ -1979,20 +2095,13 @@
                 <w:sz w:val="28"/>
                 <w:szCs w:val="28"/>
               </w:rPr>
+              <w:lastRenderedPageBreak/>
               <mc:AlternateContent>
                 <mc:Choice Requires="wps">
                   <w:drawing>
-                    <wp:anchor distT="0" distB="0" distL="114300" distR="114300" simplePos="0" relativeHeight="251667456" behindDoc="0" locked="0" layoutInCell="1" allowOverlap="1" wp14:anchorId="2F1672B1" wp14:editId="697E1EB7">
-                      <wp:simplePos x="0" y="0"/>
-                      <wp:positionH relativeFrom="column">
-                        <wp:posOffset>-132554</wp:posOffset>
-                      </wp:positionH>
-                      <wp:positionV relativeFrom="paragraph">
-                        <wp:posOffset>85090</wp:posOffset>
-                      </wp:positionV>
+                    <wp:inline distT="0" distB="0" distL="0" distR="0" wp14:anchorId="2F1672B1" wp14:editId="646816EC">
                       <wp:extent cx="7092000" cy="0"/>
-                      <wp:effectExtent l="0" t="19050" r="33020" b="19050"/>
-                      <wp:wrapNone/>
+                      <wp:effectExtent l="0" t="38100" r="52070" b="38100"/>
                       <wp:docPr id="2018724291" name="Straight Connector 32"/>
                       <wp:cNvGraphicFramePr/>
                       <a:graphic xmlns:a="http://schemas.openxmlformats.org/drawingml/2006/main">
@@ -2007,7 +2116,7 @@
                               <a:prstGeom prst="line">
                                 <a:avLst/>
                               </a:prstGeom>
-                              <a:ln w="38100">
+                              <a:ln w="76200">
                                 <a:solidFill>
                                   <a:srgbClr val="CBCFD4"/>
                                 </a:solidFill>
@@ -2031,16 +2140,14 @@
                           </wps:wsp>
                         </a:graphicData>
                       </a:graphic>
-                      <wp14:sizeRelH relativeFrom="margin">
-                        <wp14:pctWidth>0</wp14:pctWidth>
-                      </wp14:sizeRelH>
-                    </wp:anchor>
+                    </wp:inline>
                   </w:drawing>
                 </mc:Choice>
                 <mc:Fallback>
                   <w:pict>
-                    <v:line w14:anchorId="12A165B9" id="Straight Connector 32" o:spid="_x0000_s1026" style="position:absolute;z-index:251667456;visibility:visible;mso-wrap-style:square;mso-width-percent:0;mso-wrap-distance-left:9pt;mso-wrap-distance-top:0;mso-wrap-distance-right:9pt;mso-wrap-distance-bottom:0;mso-position-horizontal:absolute;mso-position-horizontal-relative:text;mso-position-vertical:absolute;mso-position-vertical-relative:text;mso-width-percent:0;mso-width-relative:margin" from="-10.45pt,6.7pt" to="548pt,6.7pt" o:gfxdata="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" strokecolor="#cbcfd4" strokeweight="3pt">
+                    <v:line w14:anchorId="6EC46E3E" id="Straight Connector 32" o:spid="_x0000_s1026" style="visibility:visible;mso-wrap-style:square;mso-left-percent:-10001;mso-top-percent:-10001;mso-position-horizontal:absolute;mso-position-horizontal-relative:char;mso-position-vertical:absolute;mso-position-vertical-relative:line;mso-left-percent:-10001;mso-top-percent:-10001" from="0,0" to="558.45pt,0" o:gfxdata="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" strokecolor="#cbcfd4" strokeweight="6pt">
                       <v:stroke joinstyle="miter"/>
+                      <w10:anchorlock/>
                     </v:line>
                   </w:pict>
                 </mc:Fallback>
@@ -2218,7 +2325,6 @@
                 <w:sz w:val="20"/>
                 <w:szCs w:val="20"/>
               </w:rPr>
-              <w:lastRenderedPageBreak/>
               <w:t>Integrat</w:t>
             </w:r>
             <w:r>
@@ -2283,19 +2389,8 @@
                 <w:sz w:val="20"/>
                 <w:szCs w:val="20"/>
               </w:rPr>
-              <w:t>up on-premise Cloud Server (</w:t>
-            </w:r>
-            <w:proofErr w:type="spellStart"/>
-            <w:r>
-              <w:rPr>
-                <w:rFonts w:ascii="Inter 18pt 18pt" w:hAnsi="Inter 18pt 18pt"/>
-                <w:color w:val="52575E"/>
-                <w:sz w:val="20"/>
-                <w:szCs w:val="20"/>
-              </w:rPr>
-              <w:t>Nextcloud</w:t>
-            </w:r>
-            <w:proofErr w:type="spellEnd"/>
+              <w:t>up on-premise Cloud Server (Nextcloud</w:t>
+            </w:r>
             <w:r>
               <w:rPr>
                 <w:rFonts w:ascii="Inter 18pt 18pt" w:hAnsi="Inter 18pt 18pt"/>
@@ -2747,6 +2842,16 @@
           </w:p>
           <w:p>
             <w:pPr>
+              <w:snapToGrid w:val="0"/>
+              <w:rPr>
+                <w:rFonts w:ascii="Inter 18pt 18pt" w:hAnsi="Inter 18pt 18pt"/>
+                <w:sz w:val="32"/>
+                <w:szCs w:val="32"/>
+              </w:rPr>
+            </w:pPr>
+          </w:p>
+          <w:p>
+            <w:pPr>
               <w:rPr>
                 <w:rFonts w:ascii="Playfair Display" w:hAnsi="Playfair Display" w:cs="Times New Roman (Body CS)"/>
                 <w:b/>
@@ -2765,7 +2870,18 @@
                 <w:sz w:val="28"/>
                 <w:szCs w:val="28"/>
               </w:rPr>
-              <w:t>Professional Courses</w:t>
+              <w:t xml:space="preserve">Professional </w:t>
+            </w:r>
+            <w:r>
+              <w:rPr>
+                <w:rFonts w:ascii="Playfair Display" w:hAnsi="Playfair Display" w:cs="Times New Roman (Body CS)"/>
+                <w:b/>
+                <w:bCs/>
+                <w:color w:val="1588CF"/>
+                <w:sz w:val="28"/>
+                <w:szCs w:val="28"/>
+              </w:rPr>
+              <w:t>Projects</w:t>
             </w:r>
           </w:p>
           <w:p>
@@ -2790,18 +2906,10 @@
               <mc:AlternateContent>
                 <mc:Choice Requires="wps">
                   <w:drawing>
-                    <wp:anchor distT="0" distB="0" distL="114300" distR="114300" simplePos="0" relativeHeight="251669504" behindDoc="0" locked="0" layoutInCell="1" allowOverlap="1" wp14:anchorId="64A9AF74" wp14:editId="4BA25006">
-                      <wp:simplePos x="0" y="0"/>
-                      <wp:positionH relativeFrom="column">
-                        <wp:posOffset>-131919</wp:posOffset>
-                      </wp:positionH>
-                      <wp:positionV relativeFrom="paragraph">
-                        <wp:posOffset>85090</wp:posOffset>
-                      </wp:positionV>
-                      <wp:extent cx="7092000" cy="0"/>
-                      <wp:effectExtent l="0" t="19050" r="33020" b="19050"/>
-                      <wp:wrapNone/>
-                      <wp:docPr id="1542576244" name="Straight Connector 32"/>
+                    <wp:inline distT="0" distB="0" distL="0" distR="0" wp14:anchorId="61D09170" wp14:editId="68E894D9">
+                      <wp:extent cx="7091680" cy="0"/>
+                      <wp:effectExtent l="0" t="38100" r="52070" b="38100"/>
+                      <wp:docPr id="2" name="Straight Connector 32"/>
                       <wp:cNvGraphicFramePr/>
                       <a:graphic xmlns:a="http://schemas.openxmlformats.org/drawingml/2006/main">
                         <a:graphicData uri="http://schemas.microsoft.com/office/word/2010/wordprocessingShape">
@@ -2810,12 +2918,12 @@
                             <wps:spPr>
                               <a:xfrm>
                                 <a:off x="0" y="0"/>
-                                <a:ext cx="7092000" cy="0"/>
+                                <a:ext cx="7091680" cy="0"/>
                               </a:xfrm>
                               <a:prstGeom prst="line">
                                 <a:avLst/>
                               </a:prstGeom>
-                              <a:ln w="38100">
+                              <a:ln w="76200">
                                 <a:solidFill>
                                   <a:srgbClr val="CBCFD4"/>
                                 </a:solidFill>
@@ -2839,21 +2947,154 @@
                           </wps:wsp>
                         </a:graphicData>
                       </a:graphic>
-                      <wp14:sizeRelH relativeFrom="margin">
-                        <wp14:pctWidth>0</wp14:pctWidth>
-                      </wp14:sizeRelH>
-                    </wp:anchor>
+                    </wp:inline>
                   </w:drawing>
                 </mc:Choice>
                 <mc:Fallback>
                   <w:pict>
-                    <v:line w14:anchorId="7CEA1EE7" id="Straight Connector 32" o:spid="_x0000_s1026" style="position:absolute;z-index:251669504;visibility:visible;mso-wrap-style:square;mso-width-percent:0;mso-wrap-distance-left:9pt;mso-wrap-distance-top:0;mso-wrap-distance-right:9pt;mso-wrap-distance-bottom:0;mso-position-horizontal:absolute;mso-position-horizontal-relative:text;mso-position-vertical:absolute;mso-position-vertical-relative:text;mso-width-percent:0;mso-width-relative:margin" from="-10.4pt,6.7pt" to="548.05pt,6.7pt" o:gfxdata="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" strokecolor="#cbcfd4" strokeweight="3pt">
+                    <v:line w14:anchorId="3CF5B1DC" id="Straight Connector 32" o:spid="_x0000_s1026" style="visibility:visible;mso-wrap-style:square;mso-left-percent:-10001;mso-top-percent:-10001;mso-position-horizontal:absolute;mso-position-horizontal-relative:char;mso-position-vertical:absolute;mso-position-vertical-relative:line;mso-left-percent:-10001;mso-top-percent:-10001" from="0,0" to="558.4pt,0" o:gfxdata="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" strokecolor="#cbcfd4" strokeweight="6pt">
                       <v:stroke joinstyle="miter"/>
+                      <w10:anchorlock/>
                     </v:line>
                   </w:pict>
                 </mc:Fallback>
               </mc:AlternateContent>
             </w:r>
+          </w:p>
+          <w:p>
+            <w:pPr>
+              <w:snapToGrid w:val="0"/>
+              <w:rPr>
+                <w:rFonts w:ascii="Inter 18pt 18pt" w:hAnsi="Inter 18pt 18pt"/>
+                <w:sz w:val="32"/>
+                <w:szCs w:val="32"/>
+              </w:rPr>
+            </w:pPr>
+          </w:p>
+          <w:p>
+            <w:pPr>
+              <w:snapToGrid w:val="0"/>
+              <w:rPr>
+                <w:rFonts w:ascii="Inter 18pt 18pt" w:hAnsi="Inter 18pt 18pt"/>
+                <w:sz w:val="32"/>
+                <w:szCs w:val="32"/>
+              </w:rPr>
+            </w:pPr>
+          </w:p>
+          <w:p>
+            <w:pPr>
+              <w:snapToGrid w:val="0"/>
+              <w:rPr>
+                <w:rFonts w:ascii="Inter 18pt 18pt" w:hAnsi="Inter 18pt 18pt"/>
+                <w:sz w:val="32"/>
+                <w:szCs w:val="32"/>
+              </w:rPr>
+            </w:pPr>
+          </w:p>
+          <w:p>
+            <w:pPr>
+              <w:rPr>
+                <w:rFonts w:ascii="Playfair Display" w:hAnsi="Playfair Display" w:cs="Times New Roman (Body CS)"/>
+                <w:b/>
+                <w:bCs/>
+                <w:color w:val="1588CF"/>
+                <w:sz w:val="28"/>
+                <w:szCs w:val="28"/>
+              </w:rPr>
+            </w:pPr>
+            <w:r>
+              <w:rPr>
+                <w:rFonts w:ascii="Playfair Display" w:hAnsi="Playfair Display" w:cs="Times New Roman (Body CS)"/>
+                <w:b/>
+                <w:bCs/>
+                <w:color w:val="1588CF"/>
+                <w:sz w:val="28"/>
+                <w:szCs w:val="28"/>
+              </w:rPr>
+              <w:t>Professional Courses</w:t>
+            </w:r>
+          </w:p>
+          <w:p>
+            <w:pPr>
+              <w:snapToGrid w:val="0"/>
+              <w:rPr>
+                <w:rFonts w:ascii="Inter 18pt 18pt" w:hAnsi="Inter 18pt 18pt"/>
+                <w:sz w:val="32"/>
+                <w:szCs w:val="32"/>
+              </w:rPr>
+            </w:pPr>
+            <w:r>
+              <w:rPr>
+                <w:rFonts w:cs="Times New Roman (Body CS)"/>
+                <w:b/>
+                <w:bCs/>
+                <w:noProof/>
+                <w:color w:val="81311A"/>
+                <w:sz w:val="28"/>
+                <w:szCs w:val="28"/>
+              </w:rPr>
+              <mc:AlternateContent>
+                <mc:Choice Requires="wps">
+                  <w:drawing>
+                    <wp:inline distT="0" distB="0" distL="0" distR="0" wp14:anchorId="64A9AF74" wp14:editId="51817160">
+                      <wp:extent cx="7092000" cy="0"/>
+                      <wp:effectExtent l="0" t="38100" r="52070" b="38100"/>
+                      <wp:docPr id="1542576244" name="Straight Connector 32"/>
+                      <wp:cNvGraphicFramePr/>
+                      <a:graphic xmlns:a="http://schemas.openxmlformats.org/drawingml/2006/main">
+                        <a:graphicData uri="http://schemas.microsoft.com/office/word/2010/wordprocessingShape">
+                          <wps:wsp>
+                            <wps:cNvCnPr/>
+                            <wps:spPr>
+                              <a:xfrm>
+                                <a:off x="0" y="0"/>
+                                <a:ext cx="7092000" cy="0"/>
+                              </a:xfrm>
+                              <a:prstGeom prst="line">
+                                <a:avLst/>
+                              </a:prstGeom>
+                              <a:ln w="76200">
+                                <a:solidFill>
+                                  <a:srgbClr val="CBCFD4"/>
+                                </a:solidFill>
+                              </a:ln>
+                            </wps:spPr>
+                            <wps:style>
+                              <a:lnRef idx="2">
+                                <a:schemeClr val="accent1"/>
+                              </a:lnRef>
+                              <a:fillRef idx="0">
+                                <a:schemeClr val="accent1"/>
+                              </a:fillRef>
+                              <a:effectRef idx="1">
+                                <a:schemeClr val="accent1"/>
+                              </a:effectRef>
+                              <a:fontRef idx="minor">
+                                <a:schemeClr val="tx1"/>
+                              </a:fontRef>
+                            </wps:style>
+                            <wps:bodyPr/>
+                          </wps:wsp>
+                        </a:graphicData>
+                      </a:graphic>
+                    </wp:inline>
+                  </w:drawing>
+                </mc:Choice>
+                <mc:Fallback>
+                  <w:pict>
+                    <v:line w14:anchorId="079DA8D8" id="Straight Connector 32" o:spid="_x0000_s1026" style="visibility:visible;mso-wrap-style:square;mso-left-percent:-10001;mso-top-percent:-10001;mso-position-horizontal:absolute;mso-position-horizontal-relative:char;mso-position-vertical:absolute;mso-position-vertical-relative:line;mso-left-percent:-10001;mso-top-percent:-10001" from="0,0" to="558.45pt,0" o:gfxdata="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" strokecolor="#cbcfd4" strokeweight="6pt">
+                      <v:stroke joinstyle="miter"/>
+                      <w10:anchorlock/>
+                    </v:line>
+                  </w:pict>
+                </mc:Fallback>
+              </mc:AlternateContent>
+            </w:r>
+          </w:p>
+          <w:p>
+            <w:pPr>
+              <w:spacing w:line="300" w:lineRule="auto"/>
+            </w:pPr>
           </w:p>
           <w:p>
             <w:pPr>
@@ -2915,7 +3156,6 @@
               </w:rPr>
               <w:br/>
             </w:r>
-            <w:proofErr w:type="spellStart"/>
             <w:r>
               <w:rPr>
                 <w:rFonts w:ascii="Inter 18pt 18pt" w:hAnsi="Inter 18pt 18pt"/>
@@ -2923,37 +3163,7 @@
                 <w:sz w:val="20"/>
                 <w:szCs w:val="20"/>
               </w:rPr>
-              <w:t>Institut</w:t>
-            </w:r>
-            <w:proofErr w:type="spellEnd"/>
-            <w:r>
-              <w:rPr>
-                <w:rFonts w:ascii="Inter 18pt 18pt" w:hAnsi="Inter 18pt 18pt"/>
-                <w:color w:val="24272E"/>
-                <w:sz w:val="20"/>
-                <w:szCs w:val="20"/>
-              </w:rPr>
-              <w:t xml:space="preserve"> Mines-</w:t>
-            </w:r>
-            <w:proofErr w:type="spellStart"/>
-            <w:r>
-              <w:rPr>
-                <w:rFonts w:ascii="Inter 18pt 18pt" w:hAnsi="Inter 18pt 18pt"/>
-                <w:color w:val="24272E"/>
-                <w:sz w:val="20"/>
-                <w:szCs w:val="20"/>
-              </w:rPr>
-              <w:t>Télécom</w:t>
-            </w:r>
-            <w:proofErr w:type="spellEnd"/>
-            <w:r>
-              <w:rPr>
-                <w:rFonts w:ascii="Inter 18pt 18pt" w:hAnsi="Inter 18pt 18pt"/>
-                <w:color w:val="24272E"/>
-                <w:sz w:val="20"/>
-                <w:szCs w:val="20"/>
-              </w:rPr>
-              <w:t xml:space="preserve"> (IMT)</w:t>
+              <w:t>Institut Mines-Télécom (IMT)</w:t>
             </w:r>
             <w:r>
               <w:rPr>
@@ -3726,8 +3936,86 @@
                 <w:sz w:val="28"/>
                 <w:szCs w:val="28"/>
               </w:rPr>
-              <w:lastRenderedPageBreak/>
               <w:t>Supplementary Courses</w:t>
+            </w:r>
+          </w:p>
+          <w:p>
+            <w:pPr>
+              <w:rPr>
+                <w:rFonts w:ascii="Playfair Display" w:hAnsi="Playfair Display" w:cs="Times New Roman (Body CS)"/>
+                <w:b/>
+                <w:bCs/>
+                <w:color w:val="1588CF"/>
+                <w:sz w:val="28"/>
+                <w:szCs w:val="28"/>
+              </w:rPr>
+            </w:pPr>
+            <w:r>
+              <w:rPr>
+                <w:rFonts w:cs="Times New Roman (Body CS)"/>
+                <w:b/>
+                <w:bCs/>
+                <w:noProof/>
+                <w:color w:val="81311A"/>
+                <w:sz w:val="28"/>
+                <w:szCs w:val="28"/>
+              </w:rPr>
+              <mc:AlternateContent>
+                <mc:Choice Requires="wps">
+                  <w:drawing>
+                    <wp:inline distT="0" distB="0" distL="0" distR="0" wp14:anchorId="552D8022" wp14:editId="1B0EE360">
+                      <wp:extent cx="7091680" cy="0"/>
+                      <wp:effectExtent l="0" t="38100" r="52070" b="38100"/>
+                      <wp:docPr id="1700265441" name="Straight Connector 32"/>
+                      <wp:cNvGraphicFramePr/>
+                      <a:graphic xmlns:a="http://schemas.openxmlformats.org/drawingml/2006/main">
+                        <a:graphicData uri="http://schemas.microsoft.com/office/word/2010/wordprocessingShape">
+                          <wps:wsp>
+                            <wps:cNvCnPr/>
+                            <wps:spPr>
+                              <a:xfrm>
+                                <a:off x="0" y="0"/>
+                                <a:ext cx="7091680" cy="0"/>
+                              </a:xfrm>
+                              <a:prstGeom prst="line">
+                                <a:avLst/>
+                              </a:prstGeom>
+                              <a:ln w="76200">
+                                <a:solidFill>
+                                  <a:srgbClr val="CBCFD4"/>
+                                </a:solidFill>
+                              </a:ln>
+                            </wps:spPr>
+                            <wps:style>
+                              <a:lnRef idx="2">
+                                <a:schemeClr val="accent1"/>
+                              </a:lnRef>
+                              <a:fillRef idx="0">
+                                <a:schemeClr val="accent1"/>
+                              </a:fillRef>
+                              <a:effectRef idx="1">
+                                <a:schemeClr val="accent1"/>
+                              </a:effectRef>
+                              <a:fontRef idx="minor">
+                                <a:schemeClr val="tx1"/>
+                              </a:fontRef>
+                            </wps:style>
+                            <wps:bodyPr/>
+                          </wps:wsp>
+                        </a:graphicData>
+                      </a:graphic>
+                    </wp:inline>
+                  </w:drawing>
+                </mc:Choice>
+                <mc:Fallback>
+                  <w:pict>
+                    <v:line w14:anchorId="503660F0" id="Straight Connector 32" o:spid="_x0000_s1026" style="visibility:visible;mso-wrap-style:square;mso-left-percent:-10001;mso-top-percent:-10001;mso-position-horizontal:absolute;mso-position-horizontal-relative:char;mso-position-vertical:absolute;mso-position-vertical-relative:line;mso-left-percent:-10001;mso-top-percent:-10001" from="0,0" to="558.4pt,0" o:gfxdata="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" strokecolor="#cbcfd4" strokeweight="6pt">
+                      <v:stroke joinstyle="miter"/>
+                      <w10:anchorlock/>
+                    </v:line>
+                  </w:pict>
+                </mc:Fallback>
+              </mc:AlternateContent>
             </w:r>
           </w:p>
           <w:p>
@@ -4384,6 +4672,16 @@
           </w:p>
           <w:p>
             <w:pPr>
+              <w:snapToGrid w:val="0"/>
+              <w:rPr>
+                <w:rFonts w:ascii="Inter 18pt 18pt" w:hAnsi="Inter 18pt 18pt"/>
+                <w:sz w:val="32"/>
+                <w:szCs w:val="32"/>
+              </w:rPr>
+            </w:pPr>
+          </w:p>
+          <w:p>
+            <w:pPr>
               <w:rPr>
                 <w:rFonts w:ascii="Playfair Display" w:hAnsi="Playfair Display" w:cs="Times New Roman (Body CS)"/>
                 <w:b/>
@@ -4403,6 +4701,86 @@
                 <w:szCs w:val="28"/>
               </w:rPr>
               <w:t>Skills</w:t>
+            </w:r>
+          </w:p>
+          <w:p>
+            <w:pPr>
+              <w:rPr>
+                <w:rFonts w:ascii="Inter 18pt 18pt" w:hAnsi="Inter 18pt 18pt" w:cs="Times New Roman (Body CS)"/>
+                <w:b/>
+                <w:bCs/>
+                <w:color w:val="81311A"/>
+                <w:spacing w:val="20"/>
+                <w:sz w:val="32"/>
+                <w:szCs w:val="32"/>
+              </w:rPr>
+            </w:pPr>
+            <w:r>
+              <w:rPr>
+                <w:rFonts w:cs="Times New Roman (Body CS)"/>
+                <w:b/>
+                <w:bCs/>
+                <w:noProof/>
+                <w:color w:val="81311A"/>
+                <w:sz w:val="28"/>
+                <w:szCs w:val="28"/>
+              </w:rPr>
+              <mc:AlternateContent>
+                <mc:Choice Requires="wps">
+                  <w:drawing>
+                    <wp:inline distT="0" distB="0" distL="0" distR="0" wp14:anchorId="6CF27929" wp14:editId="26A5A014">
+                      <wp:extent cx="7091680" cy="0"/>
+                      <wp:effectExtent l="0" t="38100" r="52070" b="38100"/>
+                      <wp:docPr id="1605575555" name="Straight Connector 32"/>
+                      <wp:cNvGraphicFramePr/>
+                      <a:graphic xmlns:a="http://schemas.openxmlformats.org/drawingml/2006/main">
+                        <a:graphicData uri="http://schemas.microsoft.com/office/word/2010/wordprocessingShape">
+                          <wps:wsp>
+                            <wps:cNvCnPr/>
+                            <wps:spPr>
+                              <a:xfrm>
+                                <a:off x="0" y="0"/>
+                                <a:ext cx="7091680" cy="0"/>
+                              </a:xfrm>
+                              <a:prstGeom prst="line">
+                                <a:avLst/>
+                              </a:prstGeom>
+                              <a:ln w="76200">
+                                <a:solidFill>
+                                  <a:srgbClr val="CBCFD4"/>
+                                </a:solidFill>
+                              </a:ln>
+                            </wps:spPr>
+                            <wps:style>
+                              <a:lnRef idx="2">
+                                <a:schemeClr val="accent1"/>
+                              </a:lnRef>
+                              <a:fillRef idx="0">
+                                <a:schemeClr val="accent1"/>
+                              </a:fillRef>
+                              <a:effectRef idx="1">
+                                <a:schemeClr val="accent1"/>
+                              </a:effectRef>
+                              <a:fontRef idx="minor">
+                                <a:schemeClr val="tx1"/>
+                              </a:fontRef>
+                            </wps:style>
+                            <wps:bodyPr/>
+                          </wps:wsp>
+                        </a:graphicData>
+                      </a:graphic>
+                    </wp:inline>
+                  </w:drawing>
+                </mc:Choice>
+                <mc:Fallback>
+                  <w:pict>
+                    <v:line w14:anchorId="7609F5D3" id="Straight Connector 32" o:spid="_x0000_s1026" style="visibility:visible;mso-wrap-style:square;mso-left-percent:-10001;mso-top-percent:-10001;mso-position-horizontal:absolute;mso-position-horizontal-relative:char;mso-position-vertical:absolute;mso-position-vertical-relative:line;mso-left-percent:-10001;mso-top-percent:-10001" from="0,0" to="558.4pt,0" o:gfxdata="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" strokecolor="#cbcfd4" strokeweight="6pt">
+                      <v:stroke joinstyle="miter"/>
+                      <w10:anchorlock/>
+                    </v:line>
+                  </w:pict>
+                </mc:Fallback>
+              </mc:AlternateContent>
             </w:r>
           </w:p>
           <w:p>
@@ -4430,6 +4808,104 @@
               <w:gridCol w:w="3402"/>
               <w:gridCol w:w="3402"/>
             </w:tblGrid>
+            <w:tr>
+              <w:trPr>
+                <w:trHeight w:val="335"/>
+              </w:trPr>
+              <w:tc>
+                <w:tcPr>
+                  <w:tcW w:w="3402" w:type="dxa"/>
+                </w:tcPr>
+                <w:p>
+                  <w:pPr>
+                    <w:pStyle w:val="ListParagraph"/>
+                    <w:numPr>
+                      <w:ilvl w:val="0"/>
+                      <w:numId w:val="3"/>
+                    </w:numPr>
+                    <w:snapToGrid w:val="0"/>
+                    <w:spacing w:after="80"/>
+                    <w:rPr>
+                      <w:rFonts w:ascii="Inter 18pt 18pt" w:hAnsi="Inter 18pt 18pt"/>
+                      <w:color w:val="52575E"/>
+                      <w:sz w:val="20"/>
+                      <w:szCs w:val="20"/>
+                    </w:rPr>
+                  </w:pPr>
+                  <w:r>
+                    <w:rPr>
+                      <w:rFonts w:ascii="Inter 18pt 18pt" w:hAnsi="Inter 18pt 18pt"/>
+                      <w:color w:val="52575E"/>
+                      <w:sz w:val="20"/>
+                      <w:szCs w:val="20"/>
+                    </w:rPr>
+                    <w:t>Systems Engineering</w:t>
+                  </w:r>
+                </w:p>
+              </w:tc>
+              <w:tc>
+                <w:tcPr>
+                  <w:tcW w:w="3402" w:type="dxa"/>
+                </w:tcPr>
+                <w:p>
+                  <w:pPr>
+                    <w:pStyle w:val="ListParagraph"/>
+                    <w:numPr>
+                      <w:ilvl w:val="0"/>
+                      <w:numId w:val="3"/>
+                    </w:numPr>
+                    <w:snapToGrid w:val="0"/>
+                    <w:spacing w:after="80"/>
+                    <w:rPr>
+                      <w:rFonts w:ascii="Inter 18pt 18pt" w:hAnsi="Inter 18pt 18pt"/>
+                      <w:color w:val="52575E"/>
+                      <w:sz w:val="20"/>
+                      <w:szCs w:val="20"/>
+                    </w:rPr>
+                  </w:pPr>
+                  <w:r>
+                    <w:rPr>
+                      <w:rFonts w:ascii="Inter 18pt 18pt" w:hAnsi="Inter 18pt 18pt"/>
+                      <w:color w:val="52575E"/>
+                      <w:sz w:val="20"/>
+                      <w:szCs w:val="20"/>
+                    </w:rPr>
+                    <w:t>System Administration</w:t>
+                  </w:r>
+                </w:p>
+              </w:tc>
+              <w:tc>
+                <w:tcPr>
+                  <w:tcW w:w="3402" w:type="dxa"/>
+                </w:tcPr>
+                <w:p>
+                  <w:pPr>
+                    <w:pStyle w:val="ListParagraph"/>
+                    <w:numPr>
+                      <w:ilvl w:val="0"/>
+                      <w:numId w:val="3"/>
+                    </w:numPr>
+                    <w:snapToGrid w:val="0"/>
+                    <w:spacing w:after="80"/>
+                    <w:rPr>
+                      <w:rFonts w:ascii="Inter 18pt 18pt" w:hAnsi="Inter 18pt 18pt"/>
+                      <w:color w:val="52575E"/>
+                      <w:sz w:val="20"/>
+                      <w:szCs w:val="20"/>
+                    </w:rPr>
+                  </w:pPr>
+                  <w:r>
+                    <w:rPr>
+                      <w:rFonts w:ascii="Inter 18pt 18pt" w:hAnsi="Inter 18pt 18pt"/>
+                      <w:color w:val="52575E"/>
+                      <w:sz w:val="20"/>
+                      <w:szCs w:val="20"/>
+                    </w:rPr>
+                    <w:t>PKI</w:t>
+                  </w:r>
+                </w:p>
+              </w:tc>
+            </w:tr>
             <w:tr>
               <w:trPr>
                 <w:trHeight w:val="335"/>
@@ -4765,161 +5241,6 @@
       </w:pPr>
       <w:r>
         <w:rPr>
-          <w:rFonts w:cs="Times New Roman (Body CS)"/>
-          <w:b/>
-          <w:bCs/>
-          <w:noProof/>
-          <w:color w:val="81311A"/>
-          <w:sz w:val="28"/>
-          <w:szCs w:val="28"/>
-        </w:rPr>
-        <w:lastRenderedPageBreak/>
-        <mc:AlternateContent>
-          <mc:Choice Requires="wps">
-            <w:drawing>
-              <wp:anchor distT="0" distB="0" distL="114300" distR="114300" simplePos="0" relativeHeight="251673600" behindDoc="0" locked="0" layoutInCell="1" allowOverlap="1" wp14:anchorId="56BAFAE8" wp14:editId="075F51F7">
-                <wp:simplePos x="0" y="0"/>
-                <wp:positionH relativeFrom="column">
-                  <wp:posOffset>-62704</wp:posOffset>
-                </wp:positionH>
-                <wp:positionV relativeFrom="paragraph">
-                  <wp:posOffset>-1136650</wp:posOffset>
-                </wp:positionV>
-                <wp:extent cx="7091680" cy="0"/>
-                <wp:effectExtent l="0" t="19050" r="33020" b="19050"/>
-                <wp:wrapNone/>
-                <wp:docPr id="1605575555" name="Straight Connector 32"/>
-                <wp:cNvGraphicFramePr/>
-                <a:graphic xmlns:a="http://schemas.openxmlformats.org/drawingml/2006/main">
-                  <a:graphicData uri="http://schemas.microsoft.com/office/word/2010/wordprocessingShape">
-                    <wps:wsp>
-                      <wps:cNvCnPr/>
-                      <wps:spPr>
-                        <a:xfrm>
-                          <a:off x="0" y="0"/>
-                          <a:ext cx="7091680" cy="0"/>
-                        </a:xfrm>
-                        <a:prstGeom prst="line">
-                          <a:avLst/>
-                        </a:prstGeom>
-                        <a:ln w="38100">
-                          <a:solidFill>
-                            <a:srgbClr val="CBCFD4"/>
-                          </a:solidFill>
-                        </a:ln>
-                      </wps:spPr>
-                      <wps:style>
-                        <a:lnRef idx="2">
-                          <a:schemeClr val="accent1"/>
-                        </a:lnRef>
-                        <a:fillRef idx="0">
-                          <a:schemeClr val="accent1"/>
-                        </a:fillRef>
-                        <a:effectRef idx="1">
-                          <a:schemeClr val="accent1"/>
-                        </a:effectRef>
-                        <a:fontRef idx="minor">
-                          <a:schemeClr val="tx1"/>
-                        </a:fontRef>
-                      </wps:style>
-                      <wps:bodyPr/>
-                    </wps:wsp>
-                  </a:graphicData>
-                </a:graphic>
-                <wp14:sizeRelH relativeFrom="margin">
-                  <wp14:pctWidth>0</wp14:pctWidth>
-                </wp14:sizeRelH>
-              </wp:anchor>
-            </w:drawing>
-          </mc:Choice>
-          <mc:Fallback>
-            <w:pict>
-              <v:line w14:anchorId="74D527E5" id="Straight Connector 32" o:spid="_x0000_s1026" style="position:absolute;z-index:251673600;visibility:visible;mso-wrap-style:square;mso-width-percent:0;mso-wrap-distance-left:9pt;mso-wrap-distance-top:0;mso-wrap-distance-right:9pt;mso-wrap-distance-bottom:0;mso-position-horizontal:absolute;mso-position-horizontal-relative:text;mso-position-vertical:absolute;mso-position-vertical-relative:text;mso-width-percent:0;mso-width-relative:margin" from="-4.95pt,-89.5pt" to="553.45pt,-89.5pt" o:gfxdata="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" strokecolor="#cbcfd4" strokeweight="3pt">
-                <v:stroke joinstyle="miter"/>
-              </v:line>
-            </w:pict>
-          </mc:Fallback>
-        </mc:AlternateContent>
-      </w:r>
-      <w:r>
-        <w:rPr>
-          <w:rFonts w:cs="Times New Roman (Body CS)"/>
-          <w:b/>
-          <w:bCs/>
-          <w:noProof/>
-          <w:color w:val="81311A"/>
-          <w:sz w:val="28"/>
-          <w:szCs w:val="28"/>
-        </w:rPr>
-        <mc:AlternateContent>
-          <mc:Choice Requires="wps">
-            <w:drawing>
-              <wp:anchor distT="0" distB="0" distL="114300" distR="114300" simplePos="0" relativeHeight="251671552" behindDoc="0" locked="0" layoutInCell="1" allowOverlap="1" wp14:anchorId="54D2C888" wp14:editId="1645D0AC">
-                <wp:simplePos x="0" y="0"/>
-                <wp:positionH relativeFrom="column">
-                  <wp:posOffset>-63661</wp:posOffset>
-                </wp:positionH>
-                <wp:positionV relativeFrom="paragraph">
-                  <wp:posOffset>-6341745</wp:posOffset>
-                </wp:positionV>
-                <wp:extent cx="7091680" cy="0"/>
-                <wp:effectExtent l="0" t="19050" r="33020" b="19050"/>
-                <wp:wrapNone/>
-                <wp:docPr id="1700265441" name="Straight Connector 32"/>
-                <wp:cNvGraphicFramePr/>
-                <a:graphic xmlns:a="http://schemas.openxmlformats.org/drawingml/2006/main">
-                  <a:graphicData uri="http://schemas.microsoft.com/office/word/2010/wordprocessingShape">
-                    <wps:wsp>
-                      <wps:cNvCnPr/>
-                      <wps:spPr>
-                        <a:xfrm>
-                          <a:off x="0" y="0"/>
-                          <a:ext cx="7091680" cy="0"/>
-                        </a:xfrm>
-                        <a:prstGeom prst="line">
-                          <a:avLst/>
-                        </a:prstGeom>
-                        <a:ln w="38100">
-                          <a:solidFill>
-                            <a:srgbClr val="CBCFD4"/>
-                          </a:solidFill>
-                        </a:ln>
-                      </wps:spPr>
-                      <wps:style>
-                        <a:lnRef idx="2">
-                          <a:schemeClr val="accent1"/>
-                        </a:lnRef>
-                        <a:fillRef idx="0">
-                          <a:schemeClr val="accent1"/>
-                        </a:fillRef>
-                        <a:effectRef idx="1">
-                          <a:schemeClr val="accent1"/>
-                        </a:effectRef>
-                        <a:fontRef idx="minor">
-                          <a:schemeClr val="tx1"/>
-                        </a:fontRef>
-                      </wps:style>
-                      <wps:bodyPr/>
-                    </wps:wsp>
-                  </a:graphicData>
-                </a:graphic>
-                <wp14:sizeRelH relativeFrom="margin">
-                  <wp14:pctWidth>0</wp14:pctWidth>
-                </wp14:sizeRelH>
-              </wp:anchor>
-            </w:drawing>
-          </mc:Choice>
-          <mc:Fallback>
-            <w:pict>
-              <v:line w14:anchorId="15298213" id="Straight Connector 32" o:spid="_x0000_s1026" style="position:absolute;z-index:251671552;visibility:visible;mso-wrap-style:square;mso-width-percent:0;mso-wrap-distance-left:9pt;mso-wrap-distance-top:0;mso-wrap-distance-right:9pt;mso-wrap-distance-bottom:0;mso-position-horizontal:absolute;mso-position-horizontal-relative:text;mso-position-vertical:absolute;mso-position-vertical-relative:text;mso-width-percent:0;mso-width-relative:margin" from="-5pt,-499.35pt" to="553.4pt,-499.35pt" o:gfxdata="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" strokecolor="#cbcfd4" strokeweight="3pt">
-                <v:stroke joinstyle="miter"/>
-              </v:line>
-            </w:pict>
-          </mc:Fallback>
-        </mc:AlternateContent>
-      </w:r>
-      <w:r>
-        <w:rPr>
           <w:rFonts w:ascii="Playfair Display" w:hAnsi="Playfair Display" w:cs="Times New Roman (Body CS)"/>
           <w:b/>
           <w:bCs/>
@@ -4927,6 +5248,7 @@
           <w:sz w:val="28"/>
           <w:szCs w:val="28"/>
         </w:rPr>
+        <w:lastRenderedPageBreak/>
         <w:t>Hobbies, and Volunteer Work</w:t>
       </w:r>
     </w:p>
@@ -4954,17 +5276,9 @@
         <mc:AlternateContent>
           <mc:Choice Requires="wps">
             <w:drawing>
-              <wp:anchor distT="0" distB="0" distL="114300" distR="114300" simplePos="0" relativeHeight="251679744" behindDoc="0" locked="0" layoutInCell="1" allowOverlap="1" wp14:anchorId="2BE55433" wp14:editId="607D5DF3">
-                <wp:simplePos x="0" y="0"/>
-                <wp:positionH relativeFrom="column">
-                  <wp:posOffset>-50004</wp:posOffset>
-                </wp:positionH>
-                <wp:positionV relativeFrom="paragraph">
-                  <wp:posOffset>45085</wp:posOffset>
-                </wp:positionV>
-                <wp:extent cx="7086600" cy="38100"/>
-                <wp:effectExtent l="19050" t="19050" r="19050" b="19050"/>
-                <wp:wrapNone/>
+              <wp:inline distT="0" distB="0" distL="0" distR="0" wp14:anchorId="2BE55433" wp14:editId="099E156F">
+                <wp:extent cx="7092000" cy="0"/>
+                <wp:effectExtent l="0" t="38100" r="52070" b="38100"/>
                 <wp:docPr id="3" name="Straight Connector 32"/>
                 <wp:cNvGraphicFramePr/>
                 <a:graphic xmlns:a="http://schemas.openxmlformats.org/drawingml/2006/main">
@@ -4974,12 +5288,12 @@
                       <wps:spPr>
                         <a:xfrm flipV="1">
                           <a:off x="0" y="0"/>
-                          <a:ext cx="7086600" cy="38100"/>
+                          <a:ext cx="7092000" cy="0"/>
                         </a:xfrm>
                         <a:prstGeom prst="line">
                           <a:avLst/>
                         </a:prstGeom>
-                        <a:ln w="38100">
+                        <a:ln w="76200">
                           <a:solidFill>
                             <a:srgbClr val="CBCFD4"/>
                           </a:solidFill>
@@ -5003,19 +5317,14 @@
                     </wps:wsp>
                   </a:graphicData>
                 </a:graphic>
-                <wp14:sizeRelH relativeFrom="margin">
-                  <wp14:pctWidth>0</wp14:pctWidth>
-                </wp14:sizeRelH>
-                <wp14:sizeRelV relativeFrom="margin">
-                  <wp14:pctHeight>0</wp14:pctHeight>
-                </wp14:sizeRelV>
-              </wp:anchor>
+              </wp:inline>
             </w:drawing>
           </mc:Choice>
           <mc:Fallback>
             <w:pict>
-              <v:line w14:anchorId="1737E651" id="Straight Connector 32" o:spid="_x0000_s1026" style="position:absolute;flip:y;z-index:251679744;visibility:visible;mso-wrap-style:square;mso-width-percent:0;mso-height-percent:0;mso-wrap-distance-left:9pt;mso-wrap-distance-top:0;mso-wrap-distance-right:9pt;mso-wrap-distance-bottom:0;mso-position-horizontal:absolute;mso-position-horizontal-relative:text;mso-position-vertical:absolute;mso-position-vertical-relative:text;mso-width-percent:0;mso-height-percent:0;mso-width-relative:margin;mso-height-relative:margin" from="-3.95pt,3.55pt" to="554.05pt,6.55pt" o:gfxdata="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" strokecolor="#cbcfd4" strokeweight="3pt">
+              <v:line w14:anchorId="7E1C1E97" id="Straight Connector 32" o:spid="_x0000_s1026" style="flip:y;visibility:visible;mso-wrap-style:square;mso-left-percent:-10001;mso-top-percent:-10001;mso-position-horizontal:absolute;mso-position-horizontal-relative:char;mso-position-vertical:absolute;mso-position-vertical-relative:line;mso-left-percent:-10001;mso-top-percent:-10001" from="0,0" to="558.45pt,0" o:gfxdata="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" strokecolor="#cbcfd4" strokeweight="6pt">
                 <v:stroke joinstyle="miter"/>
+                <w10:anchorlock/>
               </v:line>
             </w:pict>
           </mc:Fallback>
@@ -5399,7 +5708,7 @@
           <w:sz w:val="20"/>
           <w:szCs w:val="20"/>
         </w:rPr>
-        <w:t>As an electronics engineer, I apply my knowledge and skills to design, develop, and administer solutions for networking and telecommunications setups. I work with a diverse and collaborative team of engineers, technicians, and managers to keep my organization's networks at utmost readiness. I graduated from NUST with a bachelor's degree in Avionics Engineering in October 2022, where I learned the fundamentals and applications of avionics engineering, such as navigation, communication, surveillance, flight control, and electronic warfare systems. I also enhanced my programming, IT, and web development skills by self-paced learning techniques. I am passionate about learning new technologies and languages, and I am always eager to take on new challenges and opportunities.</w:t>
+        <w:t xml:space="preserve">I am a Networking and Systems Engineer with a solid foundation in avionics engineering and over three years of hands-on experience in enterprise-grade networks, systems administration, and secure infrastructure management. </w:t>
       </w:r>
     </w:p>
     <w:p>
@@ -5409,6 +5718,28 @@
           <w:szCs w:val="20"/>
         </w:rPr>
       </w:pPr>
+      <w:r>
+        <w:rPr>
+          <w:sz w:val="20"/>
+          <w:szCs w:val="20"/>
+        </w:rPr>
+        <w:t xml:space="preserve">I currently work on designing, maintaining, and securing critical IT systems, with a strong focus on reliability, performance, and audit-ready processes, along with disciplined implementation of InfoSec governance, risk, and compliance. </w:t>
+      </w:r>
+    </w:p>
+    <w:p>
+      <w:pPr>
+        <w:rPr>
+          <w:sz w:val="20"/>
+          <w:szCs w:val="20"/>
+        </w:rPr>
+      </w:pPr>
+      <w:r>
+        <w:rPr>
+          <w:sz w:val="20"/>
+          <w:szCs w:val="20"/>
+        </w:rPr>
+        <w:t>I’m continuously building my skills across modern infrastructure, automation, and cybersecurity to deliver dependable and scalable solutions.</w:t>
+      </w:r>
     </w:p>
     <w:p>
       <w:pPr>
@@ -5437,23 +5768,7 @@
           <w:sz w:val="20"/>
           <w:szCs w:val="20"/>
         </w:rPr>
-        <w:t>PAF College Sargodha F. Sc (Pre-</w:t>
-      </w:r>
-      <w:proofErr w:type="spellStart"/>
-      <w:r>
-        <w:rPr>
-          <w:sz w:val="20"/>
-          <w:szCs w:val="20"/>
-        </w:rPr>
-        <w:t>Engg</w:t>
-      </w:r>
-      <w:proofErr w:type="spellEnd"/>
-      <w:r>
-        <w:rPr>
-          <w:sz w:val="20"/>
-          <w:szCs w:val="20"/>
-        </w:rPr>
-        <w:t>), Theoretical and Mathematical Physics · (April 2013 - July 2018</w:t>
+        <w:t>PAF College Sargodha F. Sc (Pre-Engg), Theoretical and Mathematical Physics · (April 2013 - July 2018</w:t>
       </w:r>
     </w:p>
     <w:p>

</xml_diff>